<commit_message>
docs: add all-in-one comprehensive report covering 3 regular tests and final exam (40 criteria) for Group 2
</commit_message>
<xml_diff>
--- a/docs/Bao_Cao_Tien_Do_Nhom_02.docx
+++ b/docs/Bao_Cao_Tien_Do_Nhom_02.docx
@@ -198,38 +198,6 @@
         <w:t>3. Cấu hình thành công pipeline GitHub Actions CI/CD đạt trạng thái XANH TUYỆT ĐỐI (Success) trên mọi môi trường.</w:t>
         <w:br/>
         <w:t>4. Hoàn thiện cơ chế phòng thủ Zero-Downtime Fallback cho các chức năng AI.</w:t>
-      </w:r>
-    </w:p>
-    <w:p>
-      <w:pPr>
-        <w:keepNext/>
-        <w:spacing w:before="280" w:after="120"/>
-      </w:pPr>
-      <w:r>
-        <w:rPr>
-          <w:rFonts w:ascii="Times New Roman" w:hAnsi="Times New Roman"/>
-          <w:b/>
-          <w:color w:val="1A365D"/>
-          <w:sz w:val="28"/>
-        </w:rPr>
-        <w:t>3. Phân công thuyết trình bảo vệ Nhóm 02</w:t>
-      </w:r>
-    </w:p>
-    <w:p>
-      <w:pPr>
-        <w:spacing w:before="60" w:after="80" w:line="312" w:lineRule="auto"/>
-      </w:pPr>
-      <w:r>
-        <w:rPr>
-          <w:rFonts w:ascii="Times New Roman" w:hAnsi="Times New Roman"/>
-          <w:b w:val="0"/>
-          <w:i w:val="0"/>
-          <w:color w:val="1E293B"/>
-          <w:sz w:val="26"/>
-        </w:rPr>
-        <w:t>• Trưởng nhóm Nguyễn Tuấn Đạt: Phụ trách thuyết trình Kiến trúc Backend, Kỹ thuật Prompt AI, Phòng vệ Fallback và Minh chứng CI/CD.</w:t>
-        <w:br/>
-        <w:t>• Phó nhóm Phàn Ngọc Anh: Phụ trách demo nghiệp vụ CRUD, bộ lọc tìm kiếm, tương tác giao diện người dùng và quản lý CSDL.</w:t>
       </w:r>
     </w:p>
     <w:sectPr>

</xml_diff>